<commit_message>
feat: Fase 2 — backtest fijo, universo S&P 500 y estrategias H1-H3
- backtest_fijo.py: vara de medir congelada (snapshots v1 S&P 100, v2 S&P 500,
  form4_v1), walk-forward, holdout de una sola ejecución, historial.csv
- Fuentes nuevas: SEC companyfacts (fundamentales point-in-time), resultados
  trimestrales (Yahoo / Alpha Vantage) y Form 4 de directivos (SEC)
- H1 calidad+valor, H2 sorpresa en resultados, H3 compras de directivos:
  medidas en desarrollo, ninguna aceptada (intento 1/3, ver DECISIONS.md)
- Web: página Estrategias con ayuda, estado «No aceptada (n/3)», cartera
  teórica de hoy (H1/H2/H3) e historial legible; Configuración con estrategia
  principal y fuentes; Análisis con los 503 valores del S&P 500
- Correcciones de fase 1 (ajuste por splits, filtro de órdenes) y tests
- .gitignore: datos congelados (solo manifest), cachés y capturas fuera

Co-Authored-By: Claude Opus 5.5 <noreply@anthropic.com>
</commit_message>
<xml_diff>
--- a/Readme/Manual_AlgoTrader.docx
+++ b/Readme/Manual_AlgoTrader.docx
@@ -12166,6 +12166,658 @@
         <w:t>7. Pestaña Comparación</w:t>
       </w:r>
     </w:p>
+    <w:p>
+      <w:r>
+        <w:br w:type="page"/>
+      </w:r>
+    </w:p>
+    <w:p>
+      <w:pPr>
+        <w:pStyle w:val="Heading1"/>
+        <w:spacing w:before="280" w:after="80"/>
+      </w:pPr>
+      <w:r>
+        <w:rPr>
+          <w:color w:val="0077CC"/>
+        </w:rPr>
+        <w:t>8. Anexo: cómo se rellenan los ficheros de datos</w:t>
+      </w:r>
+    </w:p>
+    <w:p>
+      <w:pPr>
+        <w:spacing w:after="80"/>
+      </w:pPr>
+      <w:r>
+        <w:rPr>
+          <w:b w:val="0"/>
+          <w:sz w:val="22"/>
+        </w:rPr>
+        <w:t>AlgoTrader tiene dos interfaces que comparten la misma capa de datos (carpeta 'src/'): el dashboard web (este manual) y una app de escritorio PyQt6 más antigua. Ambas leen y escriben sobre los mismos ficheros, pero no todas las acciones están disponibles en las dos. Esta tabla aclara, ficha por ficha, desde qué botón concreto se rellena cada uno y si ese origen está en la web o solo en la app de escritorio.</w:t>
+      </w:r>
+    </w:p>
+    <w:p>
+      <w:pPr>
+        <w:spacing w:after="80"/>
+      </w:pPr>
+      <w:r>
+        <w:rPr>
+          <w:b/>
+          <w:color w:val="0099FF"/>
+          <w:sz w:val="22"/>
+        </w:rPr>
+        <w:t>8.1  Ficheros que sí rellena la web</w:t>
+      </w:r>
+    </w:p>
+    <w:tbl>
+      <w:tblPr>
+        <w:tblStyle w:val="TableGrid"/>
+        <w:tblW w:type="auto" w:w="0"/>
+        <w:jc w:val="center"/>
+        <w:tblLook w:firstColumn="1" w:firstRow="1" w:lastColumn="0" w:lastRow="0" w:noHBand="0" w:noVBand="1" w:val="04A0"/>
+      </w:tblPr>
+      <w:tblGrid>
+        <w:gridCol w:w="4561"/>
+        <w:gridCol w:w="4561"/>
+      </w:tblGrid>
+      <w:tr>
+        <w:tc>
+          <w:tcPr>
+            <w:tcW w:type="dxa" w:w="2736"/>
+            <w:shd w:val="clear" w:color="auto" w:fill="0077CC"/>
+          </w:tcPr>
+          <w:p>
+            <w:pPr>
+              <w:jc w:val="center"/>
+            </w:pPr>
+            <w:r>
+              <w:rPr>
+                <w:b/>
+                <w:color w:val="FFFFFF"/>
+                <w:sz w:val="20"/>
+              </w:rPr>
+              <w:t>Fichero</w:t>
+            </w:r>
+          </w:p>
+        </w:tc>
+        <w:tc>
+          <w:tcPr>
+            <w:tcW w:type="dxa" w:w="6624"/>
+            <w:shd w:val="clear" w:color="auto" w:fill="0077CC"/>
+          </w:tcPr>
+          <w:p>
+            <w:pPr>
+              <w:jc w:val="center"/>
+            </w:pPr>
+            <w:r>
+              <w:rPr>
+                <w:b/>
+                <w:color w:val="FFFFFF"/>
+                <w:sz w:val="20"/>
+              </w:rPr>
+              <w:t>Botón / origen en la web</w:t>
+            </w:r>
+          </w:p>
+        </w:tc>
+      </w:tr>
+      <w:tr>
+        <w:tc>
+          <w:tcPr>
+            <w:tcW w:type="dxa" w:w="2736"/>
+            <w:shd w:val="clear" w:color="auto" w:fill="F0F5FF"/>
+          </w:tcPr>
+          <w:p>
+            <w:pPr>
+              <w:jc w:val="center"/>
+            </w:pPr>
+            <w:r>
+              <w:rPr>
+                <w:b/>
+                <w:sz w:val="20"/>
+              </w:rPr>
+              <w:t>scan_log.csv</w:t>
+            </w:r>
+          </w:p>
+        </w:tc>
+        <w:tc>
+          <w:tcPr>
+            <w:tcW w:type="dxa" w:w="6624"/>
+            <w:shd w:val="clear" w:color="auto" w:fill="F0F5FF"/>
+          </w:tcPr>
+          <w:p>
+            <w:r>
+              <w:rPr>
+                <w:sz w:val="20"/>
+              </w:rPr>
+              <w:t>Inicio → 'Lanzar análisis ahora' (lanza scan_sp100.py) y Análisis → 'Predecir Señal'. Ambos llaman a append_scan_log(); solo guarda señales que no sean NEUTRAL.</w:t>
+            </w:r>
+          </w:p>
+        </w:tc>
+      </w:tr>
+      <w:tr>
+        <w:tc>
+          <w:tcPr>
+            <w:tcW w:type="dxa" w:w="2736"/>
+            <w:shd w:val="clear" w:color="auto" w:fill="FFFFFF"/>
+          </w:tcPr>
+          <w:p>
+            <w:pPr>
+              <w:jc w:val="center"/>
+            </w:pPr>
+            <w:r>
+              <w:rPr>
+                <w:b/>
+                <w:sz w:val="20"/>
+              </w:rPr>
+              <w:t>pending_signals.json</w:t>
+            </w:r>
+          </w:p>
+        </w:tc>
+        <w:tc>
+          <w:tcPr>
+            <w:tcW w:type="dxa" w:w="6624"/>
+            <w:shd w:val="clear" w:color="auto" w:fill="FFFFFF"/>
+          </w:tcPr>
+          <w:p>
+            <w:r>
+              <w:rPr>
+                <w:sz w:val="20"/>
+              </w:rPr>
+              <w:t>Solo el scan scan_sp100.py (automático por Task Scheduler o manual vía 'Lanzar análisis ahora'). Lo lee la tabla de señales de Inicio.</w:t>
+            </w:r>
+          </w:p>
+        </w:tc>
+      </w:tr>
+      <w:tr>
+        <w:tc>
+          <w:tcPr>
+            <w:tcW w:type="dxa" w:w="2736"/>
+            <w:shd w:val="clear" w:color="auto" w:fill="F0F5FF"/>
+          </w:tcPr>
+          <w:p>
+            <w:pPr>
+              <w:jc w:val="center"/>
+            </w:pPr>
+            <w:r>
+              <w:rPr>
+                <w:b/>
+                <w:sz w:val="20"/>
+              </w:rPr>
+              <w:t>scan_status.json</w:t>
+            </w:r>
+          </w:p>
+        </w:tc>
+        <w:tc>
+          <w:tcPr>
+            <w:tcW w:type="dxa" w:w="6624"/>
+            <w:shd w:val="clear" w:color="auto" w:fill="F0F5FF"/>
+          </w:tcPr>
+          <w:p>
+            <w:r>
+              <w:rPr>
+                <w:sz w:val="20"/>
+              </w:rPr>
+              <w:t>Inicio → 'Lanzar análisis ahora'. Estado idle/running/done/error, escrito por web/scan_runner.py mientras dura el subproceso del scan.</w:t>
+            </w:r>
+          </w:p>
+        </w:tc>
+      </w:tr>
+      <w:tr>
+        <w:tc>
+          <w:tcPr>
+            <w:tcW w:type="dxa" w:w="2736"/>
+            <w:shd w:val="clear" w:color="auto" w:fill="FFFFFF"/>
+          </w:tcPr>
+          <w:p>
+            <w:pPr>
+              <w:jc w:val="center"/>
+            </w:pPr>
+            <w:r>
+              <w:rPr>
+                <w:b/>
+                <w:sz w:val="20"/>
+              </w:rPr>
+              <w:t>settings.json</w:t>
+            </w:r>
+          </w:p>
+        </w:tc>
+        <w:tc>
+          <w:tcPr>
+            <w:tcW w:type="dxa" w:w="6624"/>
+            <w:shd w:val="clear" w:color="auto" w:fill="FFFFFF"/>
+          </w:tcPr>
+          <w:p>
+            <w:r>
+              <w:rPr>
+                <w:sz w:val="20"/>
+              </w:rPr>
+              <w:t>Configuración → 'Guardar'.</w:t>
+            </w:r>
+          </w:p>
+        </w:tc>
+      </w:tr>
+      <w:tr>
+        <w:tc>
+          <w:tcPr>
+            <w:tcW w:type="dxa" w:w="2736"/>
+            <w:shd w:val="clear" w:color="auto" w:fill="F0F5FF"/>
+          </w:tcPr>
+          <w:p>
+            <w:pPr>
+              <w:jc w:val="center"/>
+            </w:pPr>
+            <w:r>
+              <w:rPr>
+                <w:b/>
+                <w:sz w:val="20"/>
+              </w:rPr>
+              <w:t>data_cache/*.parquet</w:t>
+            </w:r>
+          </w:p>
+        </w:tc>
+        <w:tc>
+          <w:tcPr>
+            <w:tcW w:type="dxa" w:w="6624"/>
+            <w:shd w:val="clear" w:color="auto" w:fill="F0F5FF"/>
+          </w:tcPr>
+          <w:p>
+            <w:r>
+              <w:rPr>
+                <w:sz w:val="20"/>
+              </w:rPr>
+              <w:t>Cualquier análisis (scan automático o 'Predecir Señal'): caché de precios históricos por fuente de datos.</w:t>
+            </w:r>
+          </w:p>
+        </w:tc>
+      </w:tr>
+      <w:tr>
+        <w:tc>
+          <w:tcPr>
+            <w:tcW w:type="dxa" w:w="2736"/>
+            <w:shd w:val="clear" w:color="auto" w:fill="FFFFFF"/>
+          </w:tcPr>
+          <w:p>
+            <w:pPr>
+              <w:jc w:val="center"/>
+            </w:pPr>
+            <w:r>
+              <w:rPr>
+                <w:b/>
+                <w:sz w:val="20"/>
+              </w:rPr>
+              <w:t>models/*.joblib</w:t>
+            </w:r>
+          </w:p>
+        </w:tc>
+        <w:tc>
+          <w:tcPr>
+            <w:tcW w:type="dxa" w:w="6624"/>
+            <w:shd w:val="clear" w:color="auto" w:fill="FFFFFF"/>
+          </w:tcPr>
+          <w:p>
+            <w:r>
+              <w:rPr>
+                <w:sz w:val="20"/>
+              </w:rPr>
+              <w:t>Cualquier análisis: caché de los modelos de IA ya entrenados por símbolo.</w:t>
+            </w:r>
+          </w:p>
+        </w:tc>
+      </w:tr>
+    </w:tbl>
+    <w:p/>
+    <w:p>
+      <w:pPr>
+        <w:spacing w:after="80"/>
+      </w:pPr>
+      <w:r>
+        <w:rPr>
+          <w:b/>
+          <w:color w:val="0099FF"/>
+          <w:sz w:val="22"/>
+        </w:rPr>
+        <w:t>8.2  Ficheros que la web solo lee (los rellena la app de escritorio)</w:t>
+      </w:r>
+    </w:p>
+    <w:tbl>
+      <w:tblPr>
+        <w:tblStyle w:val="TableGrid"/>
+        <w:tblW w:type="auto" w:w="0"/>
+        <w:jc w:val="center"/>
+        <w:tblLook w:firstColumn="1" w:firstRow="1" w:lastColumn="0" w:lastRow="0" w:noHBand="0" w:noVBand="1" w:val="04A0"/>
+      </w:tblPr>
+      <w:tblGrid>
+        <w:gridCol w:w="4561"/>
+        <w:gridCol w:w="4561"/>
+      </w:tblGrid>
+      <w:tr>
+        <w:tc>
+          <w:tcPr>
+            <w:tcW w:type="dxa" w:w="2736"/>
+            <w:shd w:val="clear" w:color="auto" w:fill="0077CC"/>
+          </w:tcPr>
+          <w:p>
+            <w:pPr>
+              <w:jc w:val="center"/>
+            </w:pPr>
+            <w:r>
+              <w:rPr>
+                <w:b/>
+                <w:color w:val="FFFFFF"/>
+                <w:sz w:val="20"/>
+              </w:rPr>
+              <w:t>Fichero</w:t>
+            </w:r>
+          </w:p>
+        </w:tc>
+        <w:tc>
+          <w:tcPr>
+            <w:tcW w:type="dxa" w:w="6624"/>
+            <w:shd w:val="clear" w:color="auto" w:fill="0077CC"/>
+          </w:tcPr>
+          <w:p>
+            <w:pPr>
+              <w:jc w:val="center"/>
+            </w:pPr>
+            <w:r>
+              <w:rPr>
+                <w:b/>
+                <w:color w:val="FFFFFF"/>
+                <w:sz w:val="20"/>
+              </w:rPr>
+              <w:t>Quién lo rellena de verdad</w:t>
+            </w:r>
+          </w:p>
+        </w:tc>
+      </w:tr>
+      <w:tr>
+        <w:tc>
+          <w:tcPr>
+            <w:tcW w:type="dxa" w:w="2736"/>
+            <w:shd w:val="clear" w:color="auto" w:fill="F0F5FF"/>
+          </w:tcPr>
+          <w:p>
+            <w:pPr>
+              <w:jc w:val="center"/>
+            </w:pPr>
+            <w:r>
+              <w:rPr>
+                <w:b/>
+                <w:sz w:val="20"/>
+              </w:rPr>
+              <w:t>predictions_log.csv</w:t>
+            </w:r>
+          </w:p>
+        </w:tc>
+        <w:tc>
+          <w:tcPr>
+            <w:tcW w:type="dxa" w:w="6624"/>
+            <w:shd w:val="clear" w:color="auto" w:fill="F0F5FF"/>
+          </w:tcPr>
+          <w:p>
+            <w:r>
+              <w:rPr>
+                <w:sz w:val="20"/>
+              </w:rPr>
+              <w:t>Solo la app de escritorio PyQt6 (main_window.py). La pestaña Comparación de la web únicamente lo lee con get_predictions_log(); el botón 'Predecir Señal' de la web no escribe en este fichero.</w:t>
+            </w:r>
+          </w:p>
+        </w:tc>
+      </w:tr>
+      <w:tr>
+        <w:tc>
+          <w:tcPr>
+            <w:tcW w:type="dxa" w:w="2736"/>
+            <w:shd w:val="clear" w:color="auto" w:fill="FFFFFF"/>
+          </w:tcPr>
+          <w:p>
+            <w:pPr>
+              <w:jc w:val="center"/>
+            </w:pPr>
+            <w:r>
+              <w:rPr>
+                <w:b/>
+                <w:sz w:val="20"/>
+              </w:rPr>
+              <w:t>orders_log.csv</w:t>
+            </w:r>
+          </w:p>
+        </w:tc>
+        <w:tc>
+          <w:tcPr>
+            <w:tcW w:type="dxa" w:w="6624"/>
+            <w:shd w:val="clear" w:color="auto" w:fill="FFFFFF"/>
+          </w:tcPr>
+          <w:p>
+            <w:r>
+              <w:rPr>
+                <w:sz w:val="20"/>
+              </w:rPr>
+              <w:t>Solo la app de escritorio PyQt6. El panel 'Ejecutar Orden Manual' de la web envía la orden real a Alpaca, pero no la registra en este CSV — la web solo lo lee con get_orders_log().</w:t>
+            </w:r>
+          </w:p>
+        </w:tc>
+      </w:tr>
+      <w:tr>
+        <w:tc>
+          <w:tcPr>
+            <w:tcW w:type="dxa" w:w="2736"/>
+            <w:shd w:val="clear" w:color="auto" w:fill="F0F5FF"/>
+          </w:tcPr>
+          <w:p>
+            <w:pPr>
+              <w:jc w:val="center"/>
+            </w:pPr>
+            <w:r>
+              <w:rPr>
+                <w:b/>
+                <w:sz w:val="20"/>
+              </w:rPr>
+              <w:t>Analisis_Predicción/*.xlsx</w:t>
+            </w:r>
+          </w:p>
+        </w:tc>
+        <w:tc>
+          <w:tcPr>
+            <w:tcW w:type="dxa" w:w="6624"/>
+            <w:shd w:val="clear" w:color="auto" w:fill="F0F5FF"/>
+          </w:tcPr>
+          <w:p>
+            <w:r>
+              <w:rPr>
+                <w:sz w:val="20"/>
+              </w:rPr>
+              <w:t>Solo la app de escritorio PyQt6, vía save_real_data() y save_prediction(). El botón web 'Actualizar resultados reales' solo actualiza filas ya existentes (update_actuals()); si solo usas la web, nunca se crean filas nuevas aquí.</w:t>
+            </w:r>
+          </w:p>
+        </w:tc>
+      </w:tr>
+    </w:tbl>
+    <w:p/>
+    <w:p>
+      <w:pPr>
+        <w:spacing w:after="80"/>
+      </w:pPr>
+      <w:r>
+        <w:rPr>
+          <w:b/>
+          <w:color w:val="0099FF"/>
+          <w:sz w:val="22"/>
+        </w:rPr>
+        <w:t>8.3  Ficheros ajenos al dashboard web</w:t>
+      </w:r>
+    </w:p>
+    <w:tbl>
+      <w:tblPr>
+        <w:tblStyle w:val="TableGrid"/>
+        <w:tblW w:type="auto" w:w="0"/>
+        <w:jc w:val="center"/>
+        <w:tblLook w:firstColumn="1" w:firstRow="1" w:lastColumn="0" w:lastRow="0" w:noHBand="0" w:noVBand="1" w:val="04A0"/>
+      </w:tblPr>
+      <w:tblGrid>
+        <w:gridCol w:w="4561"/>
+        <w:gridCol w:w="4561"/>
+      </w:tblGrid>
+      <w:tr>
+        <w:tc>
+          <w:tcPr>
+            <w:tcW w:type="dxa" w:w="2736"/>
+            <w:shd w:val="clear" w:color="auto" w:fill="0077CC"/>
+          </w:tcPr>
+          <w:p>
+            <w:pPr>
+              <w:jc w:val="center"/>
+            </w:pPr>
+            <w:r>
+              <w:rPr>
+                <w:b/>
+                <w:color w:val="FFFFFF"/>
+                <w:sz w:val="20"/>
+              </w:rPr>
+              <w:t>Fichero</w:t>
+            </w:r>
+          </w:p>
+        </w:tc>
+        <w:tc>
+          <w:tcPr>
+            <w:tcW w:type="dxa" w:w="6624"/>
+            <w:shd w:val="clear" w:color="auto" w:fill="0077CC"/>
+          </w:tcPr>
+          <w:p>
+            <w:pPr>
+              <w:jc w:val="center"/>
+            </w:pPr>
+            <w:r>
+              <w:rPr>
+                <w:b/>
+                <w:color w:val="FFFFFF"/>
+                <w:sz w:val="20"/>
+              </w:rPr>
+              <w:t>Origen real</w:t>
+            </w:r>
+          </w:p>
+        </w:tc>
+      </w:tr>
+      <w:tr>
+        <w:tc>
+          <w:tcPr>
+            <w:tcW w:type="dxa" w:w="2736"/>
+            <w:shd w:val="clear" w:color="auto" w:fill="F0F5FF"/>
+          </w:tcPr>
+          <w:p>
+            <w:pPr>
+              <w:jc w:val="center"/>
+            </w:pPr>
+            <w:r>
+              <w:rPr>
+                <w:b/>
+                <w:sz w:val="20"/>
+              </w:rPr>
+              <w:t>scan_log_console.txt</w:t>
+            </w:r>
+          </w:p>
+        </w:tc>
+        <w:tc>
+          <w:tcPr>
+            <w:tcW w:type="dxa" w:w="6624"/>
+            <w:shd w:val="clear" w:color="auto" w:fill="F0F5FF"/>
+          </w:tcPr>
+          <w:p>
+            <w:r>
+              <w:rPr>
+                <w:sz w:val="20"/>
+              </w:rPr>
+              <w:t>run_scan.bat (Task Scheduler), que redirige la salida de consola con '&gt;&gt;'. El scan lanzado desde la web usa subprocess.DEVNULL, así que no escribe aquí.</w:t>
+            </w:r>
+          </w:p>
+        </w:tc>
+      </w:tr>
+      <w:tr>
+        <w:tc>
+          <w:tcPr>
+            <w:tcW w:type="dxa" w:w="2736"/>
+            <w:shd w:val="clear" w:color="auto" w:fill="FFFFFF"/>
+          </w:tcPr>
+          <w:p>
+            <w:pPr>
+              <w:jc w:val="center"/>
+            </w:pPr>
+            <w:r>
+              <w:rPr>
+                <w:b/>
+                <w:sz w:val="20"/>
+              </w:rPr>
+              <w:t>telegram_handler_state.json</w:t>
+            </w:r>
+          </w:p>
+        </w:tc>
+        <w:tc>
+          <w:tcPr>
+            <w:tcW w:type="dxa" w:w="6624"/>
+            <w:shd w:val="clear" w:color="auto" w:fill="FFFFFF"/>
+          </w:tcPr>
+          <w:p>
+            <w:r>
+              <w:rPr>
+                <w:sz w:val="20"/>
+              </w:rPr>
+              <w:t>telegram_handler.py, un proceso de Telegram independiente (run_handler.bat) sin relación con la web.</w:t>
+            </w:r>
+          </w:p>
+        </w:tc>
+      </w:tr>
+    </w:tbl>
+    <w:p/>
+    <w:tbl>
+      <w:tblPr>
+        <w:tblStyle w:val="TableGrid"/>
+        <w:tblW w:type="auto" w:w="0"/>
+        <w:tblLook w:firstColumn="1" w:firstRow="1" w:lastColumn="0" w:lastRow="0" w:noHBand="0" w:noVBand="1" w:val="04A0"/>
+      </w:tblPr>
+      <w:tblGrid>
+        <w:gridCol w:w="9122"/>
+      </w:tblGrid>
+      <w:tr>
+        <w:tc>
+          <w:tcPr>
+            <w:tcW w:type="dxa" w:w="9122"/>
+            <w:shd w:val="clear" w:color="auto" w:fill="E8F0F8"/>
+          </w:tcPr>
+          <w:p>
+            <w:r>
+              <w:rPr>
+                <w:b/>
+                <w:color w:val="0077CC"/>
+                <w:sz w:val="22"/>
+              </w:rPr>
+              <w:t xml:space="preserve">  En resumen:</w:t>
+            </w:r>
+          </w:p>
+          <w:p>
+            <w:pPr>
+              <w:ind w:left="283"/>
+            </w:pPr>
+            <w:r>
+              <w:rPr>
+                <w:sz w:val="20"/>
+              </w:rPr>
+              <w:t>• Si se usa solo la web (sin abrir nunca la app de escritorio), predictions_log.csv, orders_log.csv y la carpeta Analisis_Predicción se quedan vacíos o congelados.</w:t>
+            </w:r>
+          </w:p>
+          <w:p>
+            <w:pPr>
+              <w:ind w:left="283"/>
+            </w:pPr>
+            <w:r>
+              <w:rPr>
+                <w:sz w:val="20"/>
+              </w:rPr>
+              <w:t>• Eso significa que la pestaña Comparación y el histórico de aciertos por símbolo dependen hoy de datos que solo genera la app de escritorio, no el dashboard web.</w:t>
+            </w:r>
+          </w:p>
+        </w:tc>
+      </w:tr>
+    </w:tbl>
+    <w:p/>
     <w:sectPr>
       <w:pgSz w:w="12240" w:h="15840"/>
       <w:pgMar w:top="1417" w:right="1417" w:bottom="1417" w:left="1701" w:header="720" w:footer="720" w:gutter="0"/>

</xml_diff>